<commit_message>
adding A2 of DB
</commit_message>
<xml_diff>
--- a/Semester_4/Linear_Algebra/5.Matrices and matrix operations.docx
+++ b/Semester_4/Linear_Algebra/5.Matrices and matrix operations.docx
@@ -78,7 +78,25 @@
           <w:sz w:val="28"/>
           <w:szCs w:val="28"/>
         </w:rPr>
-        <w:t>Rectangular arrays of real numbers arise in contexts other than as augmented matrices for linear systems. In this section we will begin to study matrices as objects in their own right by defining operations of addition, subtraction, and multiplication on them</w:t>
+        <w:t xml:space="preserve">Rectangular arrays of real numbers arise in contexts other than as augmented matrices for linear systems. In this section we will begin to study matrices as objects </w:t>
+      </w:r>
+      <w:proofErr w:type="gramStart"/>
+      <w:r>
+        <w:rPr>
+          <w:rFonts w:ascii="Times New Roman" w:hAnsi="Times New Roman" w:cs="Times New Roman"/>
+          <w:sz w:val="28"/>
+          <w:szCs w:val="28"/>
+        </w:rPr>
+        <w:t>in their own right by</w:t>
+      </w:r>
+      <w:proofErr w:type="gramEnd"/>
+      <w:r>
+        <w:rPr>
+          <w:rFonts w:ascii="Times New Roman" w:hAnsi="Times New Roman" w:cs="Times New Roman"/>
+          <w:sz w:val="28"/>
+          <w:szCs w:val="28"/>
+        </w:rPr>
+        <w:t xml:space="preserve"> defining operations of addition, subtraction, and multiplication on them</w:t>
       </w:r>
       <w:r>
         <w:rPr>
@@ -705,7 +723,29 @@
           <w:sz w:val="28"/>
           <w:szCs w:val="28"/>
         </w:rPr>
-        <w:t>Two matrices are defined to be equal if they have the same size and their corresponding entries are equal.</w:t>
+        <w:t xml:space="preserve">Two matrices are defined to be equal if they </w:t>
+      </w:r>
+      <w:proofErr w:type="gramStart"/>
+      <w:r>
+        <w:rPr>
+          <w:rFonts w:ascii="Times New Roman" w:hAnsi="Times New Roman" w:cs="Times New Roman"/>
+          <w:bCs/>
+          <w:iCs/>
+          <w:sz w:val="28"/>
+          <w:szCs w:val="28"/>
+        </w:rPr>
+        <w:t>have</w:t>
+      </w:r>
+      <w:proofErr w:type="gramEnd"/>
+      <w:r>
+        <w:rPr>
+          <w:rFonts w:ascii="Times New Roman" w:hAnsi="Times New Roman" w:cs="Times New Roman"/>
+          <w:bCs/>
+          <w:iCs/>
+          <w:sz w:val="28"/>
+          <w:szCs w:val="28"/>
+        </w:rPr>
+        <w:t xml:space="preserve"> the same size and their corresponding entries are equal.</w:t>
       </w:r>
     </w:p>
     <w:p>
@@ -894,7 +934,51 @@
           <w:sz w:val="28"/>
           <w:szCs w:val="28"/>
         </w:rPr>
-        <w:t>If A is any matrix and c is any scalar, then the product cA is the matrix obtained by multiplying each entry of the matrix A by c. The matrix cA is said to be a scalar multiple of A.</w:t>
+        <w:t xml:space="preserve">If A is any matrix and c is any scalar, then the product </w:t>
+      </w:r>
+      <w:proofErr w:type="spellStart"/>
+      <w:r>
+        <w:rPr>
+          <w:rFonts w:ascii="Times New Roman" w:hAnsi="Times New Roman" w:cs="Times New Roman"/>
+          <w:bCs/>
+          <w:iCs/>
+          <w:sz w:val="28"/>
+          <w:szCs w:val="28"/>
+        </w:rPr>
+        <w:t>cA</w:t>
+      </w:r>
+      <w:proofErr w:type="spellEnd"/>
+      <w:r>
+        <w:rPr>
+          <w:rFonts w:ascii="Times New Roman" w:hAnsi="Times New Roman" w:cs="Times New Roman"/>
+          <w:bCs/>
+          <w:iCs/>
+          <w:sz w:val="28"/>
+          <w:szCs w:val="28"/>
+        </w:rPr>
+        <w:t xml:space="preserve"> is the matrix obtained by multiplying each entry of the matrix A by c. The matrix </w:t>
+      </w:r>
+      <w:proofErr w:type="spellStart"/>
+      <w:r>
+        <w:rPr>
+          <w:rFonts w:ascii="Times New Roman" w:hAnsi="Times New Roman" w:cs="Times New Roman"/>
+          <w:bCs/>
+          <w:iCs/>
+          <w:sz w:val="28"/>
+          <w:szCs w:val="28"/>
+        </w:rPr>
+        <w:t>cA</w:t>
+      </w:r>
+      <w:proofErr w:type="spellEnd"/>
+      <w:r>
+        <w:rPr>
+          <w:rFonts w:ascii="Times New Roman" w:hAnsi="Times New Roman" w:cs="Times New Roman"/>
+          <w:bCs/>
+          <w:iCs/>
+          <w:sz w:val="28"/>
+          <w:szCs w:val="28"/>
+        </w:rPr>
+        <w:t xml:space="preserve"> is said to be a scalar multiple of A.</w:t>
       </w:r>
     </w:p>
     <w:p>
@@ -1859,15 +1943,27 @@
           </mc:Fallback>
         </mc:AlternateContent>
       </w:r>
-      <w:r>
-        <w:rPr>
-          <w:rFonts w:ascii="Times New Roman" w:hAnsi="Times New Roman" w:cs="Times New Roman"/>
-          <w:bCs/>
-          <w:iCs/>
-          <w:sz w:val="28"/>
-          <w:szCs w:val="28"/>
-        </w:rPr>
-        <w:t xml:space="preserve">The matrix A in this equation is called the coefficient matrix of the system. The </w:t>
+      <w:proofErr w:type="gramStart"/>
+      <w:r>
+        <w:rPr>
+          <w:rFonts w:ascii="Times New Roman" w:hAnsi="Times New Roman" w:cs="Times New Roman"/>
+          <w:bCs/>
+          <w:iCs/>
+          <w:sz w:val="28"/>
+          <w:szCs w:val="28"/>
+        </w:rPr>
+        <w:t>The matrix</w:t>
+      </w:r>
+      <w:proofErr w:type="gramEnd"/>
+      <w:r>
+        <w:rPr>
+          <w:rFonts w:ascii="Times New Roman" w:hAnsi="Times New Roman" w:cs="Times New Roman"/>
+          <w:bCs/>
+          <w:iCs/>
+          <w:sz w:val="28"/>
+          <w:szCs w:val="28"/>
+        </w:rPr>
+        <w:t xml:space="preserve"> A in this equation is called the coefficient matrix of the system. The </w:t>
       </w:r>
       <w:r>
         <w:rPr>
@@ -1888,7 +1984,29 @@
           <w:sz w:val="28"/>
           <w:szCs w:val="28"/>
         </w:rPr>
-        <w:t xml:space="preserve"> for the system is obtained by adjoining b to A as the last column; thus the augmented matrix is</w:t>
+        <w:t xml:space="preserve"> for the system is obtained by adjoining b to A as the last column; </w:t>
+      </w:r>
+      <w:proofErr w:type="gramStart"/>
+      <w:r>
+        <w:rPr>
+          <w:rFonts w:ascii="Times New Roman" w:hAnsi="Times New Roman" w:cs="Times New Roman"/>
+          <w:bCs/>
+          <w:iCs/>
+          <w:sz w:val="28"/>
+          <w:szCs w:val="28"/>
+        </w:rPr>
+        <w:t>thus</w:t>
+      </w:r>
+      <w:proofErr w:type="gramEnd"/>
+      <w:r>
+        <w:rPr>
+          <w:rFonts w:ascii="Times New Roman" w:hAnsi="Times New Roman" w:cs="Times New Roman"/>
+          <w:bCs/>
+          <w:iCs/>
+          <w:sz w:val="28"/>
+          <w:szCs w:val="28"/>
+        </w:rPr>
+        <w:t xml:space="preserve"> the augmented matrix is</w:t>
       </w:r>
     </w:p>
     <w:p>
@@ -4355,15 +4473,27 @@
           <w:szCs w:val="28"/>
         </w:rPr>
       </w:pPr>
-      <w:r>
-        <w:rPr>
-          <w:rFonts w:ascii="Times New Roman" w:eastAsiaTheme="minorEastAsia" w:hAnsi="Times New Roman" w:cs="Times New Roman"/>
-          <w:bCs/>
-          <w:iCs/>
-          <w:sz w:val="28"/>
-          <w:szCs w:val="28"/>
-        </w:rPr>
-        <w:t xml:space="preserve">A square matrix </w:t>
+      <w:proofErr w:type="gramStart"/>
+      <w:r>
+        <w:rPr>
+          <w:rFonts w:ascii="Times New Roman" w:eastAsiaTheme="minorEastAsia" w:hAnsi="Times New Roman" w:cs="Times New Roman"/>
+          <w:bCs/>
+          <w:iCs/>
+          <w:sz w:val="28"/>
+          <w:szCs w:val="28"/>
+        </w:rPr>
+        <w:t>A square</w:t>
+      </w:r>
+      <w:proofErr w:type="gramEnd"/>
+      <w:r>
+        <w:rPr>
+          <w:rFonts w:ascii="Times New Roman" w:eastAsiaTheme="minorEastAsia" w:hAnsi="Times New Roman" w:cs="Times New Roman"/>
+          <w:bCs/>
+          <w:iCs/>
+          <w:sz w:val="28"/>
+          <w:szCs w:val="28"/>
+        </w:rPr>
+        <w:t xml:space="preserve"> matrix </w:t>
       </w:r>
       <w:r>
         <w:rPr>
@@ -5860,7 +5990,29 @@
           <w:sz w:val="28"/>
           <w:szCs w:val="28"/>
         </w:rPr>
-        <w:t>Q2. For any square matrices A, B , P with P invertible, Complete the following</w:t>
+        <w:t xml:space="preserve">Q2. For any square matrices A, </w:t>
+      </w:r>
+      <w:proofErr w:type="gramStart"/>
+      <w:r>
+        <w:rPr>
+          <w:rFonts w:ascii="Times New Roman" w:eastAsiaTheme="minorEastAsia" w:hAnsi="Times New Roman" w:cs="Times New Roman"/>
+          <w:bCs/>
+          <w:iCs/>
+          <w:sz w:val="28"/>
+          <w:szCs w:val="28"/>
+        </w:rPr>
+        <w:t>B ,</w:t>
+      </w:r>
+      <w:proofErr w:type="gramEnd"/>
+      <w:r>
+        <w:rPr>
+          <w:rFonts w:ascii="Times New Roman" w:eastAsiaTheme="minorEastAsia" w:hAnsi="Times New Roman" w:cs="Times New Roman"/>
+          <w:bCs/>
+          <w:iCs/>
+          <w:sz w:val="28"/>
+          <w:szCs w:val="28"/>
+        </w:rPr>
+        <w:t xml:space="preserve"> P with P invertible, Complete the following</w:t>
       </w:r>
     </w:p>
     <w:p>
@@ -5939,15 +6091,27 @@
         </w:rPr>
         <w:t xml:space="preserve">               </w:t>
       </w:r>
-      <w:r>
-        <w:rPr>
-          <w:rFonts w:ascii="Times New Roman" w:eastAsiaTheme="minorEastAsia" w:hAnsi="Times New Roman" w:cs="Times New Roman"/>
-          <w:bCs/>
-          <w:iCs/>
-          <w:sz w:val="28"/>
-          <w:szCs w:val="28"/>
-        </w:rPr>
-        <w:t>det(AB)=………………</w:t>
+      <w:proofErr w:type="gramStart"/>
+      <w:r>
+        <w:rPr>
+          <w:rFonts w:ascii="Times New Roman" w:eastAsiaTheme="minorEastAsia" w:hAnsi="Times New Roman" w:cs="Times New Roman"/>
+          <w:bCs/>
+          <w:iCs/>
+          <w:sz w:val="28"/>
+          <w:szCs w:val="28"/>
+        </w:rPr>
+        <w:t>det(</w:t>
+      </w:r>
+      <w:proofErr w:type="gramEnd"/>
+      <w:r>
+        <w:rPr>
+          <w:rFonts w:ascii="Times New Roman" w:eastAsiaTheme="minorEastAsia" w:hAnsi="Times New Roman" w:cs="Times New Roman"/>
+          <w:bCs/>
+          <w:iCs/>
+          <w:sz w:val="28"/>
+          <w:szCs w:val="28"/>
+        </w:rPr>
+        <w:t>AB)=………………</w:t>
       </w:r>
       <w:r>
         <w:rPr>
@@ -5959,15 +6123,27 @@
         </w:rPr>
         <w:t xml:space="preserve">                </w:t>
       </w:r>
-      <w:r>
-        <w:rPr>
-          <w:rFonts w:ascii="Times New Roman" w:eastAsiaTheme="minorEastAsia" w:hAnsi="Times New Roman" w:cs="Times New Roman"/>
-          <w:bCs/>
-          <w:iCs/>
-          <w:sz w:val="28"/>
-          <w:szCs w:val="28"/>
-        </w:rPr>
-        <w:t>det(PA</w:t>
+      <w:proofErr w:type="gramStart"/>
+      <w:r>
+        <w:rPr>
+          <w:rFonts w:ascii="Times New Roman" w:eastAsiaTheme="minorEastAsia" w:hAnsi="Times New Roman" w:cs="Times New Roman"/>
+          <w:bCs/>
+          <w:iCs/>
+          <w:sz w:val="28"/>
+          <w:szCs w:val="28"/>
+        </w:rPr>
+        <w:t>det(</w:t>
+      </w:r>
+      <w:proofErr w:type="gramEnd"/>
+      <w:r>
+        <w:rPr>
+          <w:rFonts w:ascii="Times New Roman" w:eastAsiaTheme="minorEastAsia" w:hAnsi="Times New Roman" w:cs="Times New Roman"/>
+          <w:bCs/>
+          <w:iCs/>
+          <w:sz w:val="28"/>
+          <w:szCs w:val="28"/>
+        </w:rPr>
+        <w:t>PA</w:t>
       </w:r>
       <m:oMath>
         <m:sSup>
@@ -7035,9 +7211,9 @@
   <inkml:trace contextRef="#ctx0" brushRef="#br0" timeOffset="7055.86">4502 849 236 0 0,'0'-38'5092'0'0,"-1"37"-5065"0"0,1 1-1 0 0,0-1 1 0 0,0 1 0 0 0,0-1-1 0 0,0 1 1 0 0,0 0 0 0 0,-1-1 0 0 0,1 1-1 0 0,0-1 1 0 0,0 1 0 0 0,-1 0 0 0 0,1-1-1 0 0,0 1 1 0 0,-1 0 0 0 0,1-1-1 0 0,0 1 1 0 0,-1 0 0 0 0,1 0 0 0 0,-1-1-1 0 0,1 1 1 0 0,0 0 0 0 0,-1 0 0 0 0,1 0-1 0 0,-1 0 1 0 0,1-1 0 0 0,-1 1 0 0 0,1 0-1 0 0,0 0 1 0 0,-1 0 0 0 0,1 0-1 0 0,-1 0 1 0 0,1 0 0 0 0,-1 0 0 0 0,1 0-1 0 0,-1 0 1 0 0,1 0 0 0 0,-1 0 0 0 0,0 1-1 0 0,-15 2 207 0 0,15-3-195 0 0,-6 3-7 0 0,0 1 0 0 0,0-1 0 0 0,0 1 0 0 0,0 0 0 0 0,1 1 0 0 0,-1 0 0 0 0,1 0 0 0 0,0 0 0 0 0,1 1 0 0 0,-7 7 0 0 0,-20 18-16 0 0,30-29-16 0 0,1-1 1 0 0,-1 1 0 0 0,1 0-1 0 0,0 0 1 0 0,-1 0 0 0 0,1 0 0 0 0,0 0-1 0 0,0 0 1 0 0,0 0 0 0 0,0 0-1 0 0,1 0 1 0 0,-1 1 0 0 0,1-1 0 0 0,-1 3-1 0 0,0-3-4 0 0,1-1 0 0 0,0 0 0 0 0,0 0 0 0 0,0 0 0 0 0,0 0 0 0 0,0 0 0 0 0,0 0 0 0 0,0 0 0 0 0,1 0 0 0 0,-1 0 1 0 0,0 0-1 0 0,1 0 0 0 0,-1 0 0 0 0,0 0 0 0 0,1 0 0 0 0,-1 0 0 0 0,1 0 0 0 0,-1-1 0 0 0,1 1 0 0 0,0 0 0 0 0,-1 0 0 0 0,1 0 0 0 0,0-1 0 0 0,0 1 0 0 0,-1 0 0 0 0,1-1 0 0 0,0 1 0 0 0,0 0 0 0 0,0-1 0 0 0,0 0 0 0 0,0 1 0 0 0,1 0 0 0 0,4 0-124 0 0,0 1 0 0 0,0-1 1 0 0,0 0-1 0 0,0 0 0 0 0,0-1 0 0 0,0 0 1 0 0,0 0-1 0 0,0 0 0 0 0,0-1 0 0 0,0 0 1 0 0,0 0-1 0 0,0 0 0 0 0,0-1 0 0 0,0 0 1 0 0,-1 0-1 0 0,1-1 0 0 0,-1 1 0 0 0,1-1 0 0 0,-1 0 1 0 0,0-1-1 0 0,0 1 0 0 0,0-1 0 0 0,5-6 1 0 0,-4 4 28 0 0,0 0 1 0 0,0-1 0 0 0,-1 0 0 0 0,0 0 0 0 0,0-1-1 0 0,-1 0 1 0 0,0 1 0 0 0,0-1 0 0 0,-1-1-1 0 0,4-10 1 0 0,-1-12 3202 0 0,-28 66-2873 0 0,17-25-221 0 0,1 0-1 0 0,0 1 1 0 0,1-1-1 0 0,0 1 1 0 0,1 0-1 0 0,-2 14 1 0 0,4-23-12 0 0,0-1 0 0 0,0 0 0 0 0,0 0 1 0 0,0 0-1 0 0,0 0 0 0 0,1 0 1 0 0,-1 0-1 0 0,0 1 0 0 0,1-1 0 0 0,-1 0 1 0 0,1 0-1 0 0,-1 0 0 0 0,1 0 1 0 0,-1 0-1 0 0,1 0 0 0 0,-1 0 0 0 0,1-1 1 0 0,0 1-1 0 0,0 0 0 0 0,0 0 1 0 0,-1 0-1 0 0,1-1 0 0 0,0 1 1 0 0,0 0-1 0 0,0-1 0 0 0,0 1 0 0 0,0-1 1 0 0,2 2-1 0 0,1-2-44 0 0,0 1 0 0 0,-1 0 0 0 0,1-1-1 0 0,0 0 1 0 0,-1 0 0 0 0,1 0 0 0 0,0 0 0 0 0,0 0 0 0 0,4-2-1 0 0,5-1-225 0 0,0 0 0 0 0,-1-1 0 0 0,0 0 0 0 0,19-10 0 0 0,-18 7 211 0 0,-1-1-1 0 0,0 0 1 0 0,0-1 0 0 0,0 0 0 0 0,-1 0-1 0 0,-1-1 1 0 0,0-1 0 0 0,0 0-1 0 0,-1 0 1 0 0,0-1 0 0 0,13-24 0 0 0,-11 17 100 0 0,-2 0 0 0 0,1-1 1 0 0,-2 0-1 0 0,-1-1 0 0 0,8-33 1 0 0,-12 32 267 0 0,-1 8 387 0 0,0 1 1 0 0,1-1 0 0 0,0 0 0 0 0,7-15 0 0 0,-9 28-531 0 0,-1 0 1 0 0,0 0-1 0 0,1-1 1 0 0,-1 1 0 0 0,0 0-1 0 0,1 0 1 0 0,-1 0-1 0 0,0-1 1 0 0,0 1 0 0 0,0 0-1 0 0,0 0 1 0 0,0 0-1 0 0,0-1 1 0 0,-1 1 0 0 0,1 0-1 0 0,0 0 1 0 0,0 0-1 0 0,-2-3 1 0 0,-2 3 952 0 0,2 14-1189 0 0,-6 36 71 0 0,0 56-24 0 0,0 48-222 0 0,8-141-454 0 0,0 1 0 0 0,-2 0 0 0 0,1 0 0 0 0,-2-1 0 0 0,-5 21 0 0 0,6-4-2937 0 0,3-17 1355 0 0,-1-8 1315 0 0</inkml:trace>
   <inkml:trace contextRef="#ctx0" brushRef="#br0" timeOffset="7636.96">4744 691 592 0 0,'15'-11'1420'0'0,"-13"9"-1393"0"0,0 1 0 0 0,0-1 0 0 0,0 0 0 0 0,1 1 0 0 0,-1 0 0 0 0,0 0 1 0 0,0 0-1 0 0,1 0 0 0 0,-1 0 0 0 0,1 0 0 0 0,-1 0 0 0 0,4 0 0 0 0,4-1-13 0 0,0 1-1 0 0,1-1 0 0 0,-1 2 1 0 0,17 0-1 0 0,-22 1-9 0 0,-1-1 0 0 0,1 1 0 0 0,0 1 1 0 0,0-1-1 0 0,0 1 0 0 0,-1-1 0 0 0,1 1 0 0 0,-1 1 0 0 0,1-1 0 0 0,-1 1 0 0 0,0-1 0 0 0,4 5 0 0 0,-2-1 26 0 0,0-1 1 0 0,0 1-1 0 0,-1 1 0 0 0,0-1 0 0 0,-1 1 1 0 0,1-1-1 0 0,-1 1 0 0 0,0 1 0 0 0,-1-1 1 0 0,0 1-1 0 0,0-1 0 0 0,3 15 0 0 0,-2-1 85 0 0,-1 1 0 0 0,-1 0-1 0 0,0 32 1 0 0,-3-49-38 0 0,1-1 0 0 0,-1 0 1 0 0,0 0-1 0 0,0 1 0 0 0,0-1 0 0 0,-1 0 1 0 0,0 0-1 0 0,1 0 0 0 0,-2-1 1 0 0,1 1-1 0 0,0 0 0 0 0,-5 4 1175 0 0,7-10-1216 0 0,0 0 0 0 0,0 0 0 0 0,0 0 0 0 0,0 0 0 0 0,1 0-1 0 0,-1 1 1 0 0,1-1 0 0 0,-1 0 0 0 0,1 0 0 0 0,-1 0 0 0 0,1 1 0 0 0,2-4 0 0 0,-3 5-26 0 0,3-16-93 0 0,3-7-128 0 0,-1 12-16 0 0,0 0 1 0 0,0-1 0 0 0,3-14-1 0 0,8-20-327 0 0,-14 41 502 0 0,2-5 3 0 0,1 0-1 0 0,0 0 0 0 0,1 0 0 0 0,11-15 1 0 0,-8 14 59 0 0,-8 9-4 0 0,0 0 1 0 0,0 1-1 0 0,1-1 1 0 0,-1 0 0 0 0,1 0-1 0 0,0 1 1 0 0,-1-1-1 0 0,1 1 1 0 0,0 0-1 0 0,0-1 1 0 0,0 1 0 0 0,0 0-1 0 0,0 0 1 0 0,0 0-1 0 0,3 0 1 0 0,-3 0 1 0 0,0 1 0 0 0,-1 0 1 0 0,1 0-1 0 0,0 0 0 0 0,0 0 0 0 0,-1 0 0 0 0,1 0 1 0 0,0 0-1 0 0,-1 0 0 0 0,1 1 0 0 0,0-1 0 0 0,-1 1 1 0 0,1-1-1 0 0,0 1 0 0 0,-1 0 0 0 0,1 0 0 0 0,-1-1 0 0 0,1 1 1 0 0,-1 0-1 0 0,1 1 0 0 0,-1-1 0 0 0,0 0 0 0 0,0 0 1 0 0,1 0-1 0 0,-1 1 0 0 0,0-1 0 0 0,0 1 0 0 0,0-1 1 0 0,0 1-1 0 0,-1-1 0 0 0,1 1 0 0 0,0-1 0 0 0,-1 1 1 0 0,1 2-1 0 0,6 6 51 0 0,-6-9-54 0 0,0 0 0 0 0,-1 0 1 0 0,1 1-1 0 0,0-1 0 0 0,-1 0 1 0 0,1 0-1 0 0,-1 0 0 0 0,1 0 1 0 0,-1 1-1 0 0,1-1 0 0 0,-1 0 0 0 0,0 1 1 0 0,0-1-1 0 0,1 2 0 0 0,6 30 43 0 0,-5-28-46 0 0,-1-1 0 0 0,1 1-1 0 0,-1-1 1 0 0,0 1 0 0 0,-1-1 0 0 0,1 7-1 0 0,3 4-6 0 0,-3-14-13 0 0,-1-1 0 0 0,0 1 0 0 0,0-1 0 0 0,1 1 0 0 0,-1 0 0 0 0,0-1 0 0 0,0 1 0 0 0,0-1 0 0 0,1 1 0 0 0,-1 0 0 0 0,0-1 0 0 0,0 1 0 0 0,0 0 0 0 0,0-1 0 0 0,0 1 0 0 0,0 0 0 0 0,0-1 0 0 0,-1 1 0 0 0,1 0 0 0 0,0-1 0 0 0,0 1 0 0 0,0-1 0 0 0,-1 1 0 0 0,1-1 0 0 0,0 1 0 0 0,-1 0 0 0 0,1-1 0 0 0,0 1 0 0 0,-1-1 0 0 0,1 1 0 0 0,-1 0 0 0 0,-1 5-421 0 0</inkml:trace>
   <inkml:trace contextRef="#ctx0" brushRef="#br0" timeOffset="7855.91">5236 462 348 0 0,'0'-2'667'0'0,"0"1"-411"0"0,0 0-1 0 0,-1 0 0 0 0,1 1 1 0 0,0-1-1 0 0,0 0 1 0 0,0 0-1 0 0,0 0 1 0 0,0 1-1 0 0,1-1 1 0 0,-1 0-1 0 0,0 0 1 0 0,0 0-1 0 0,0 1 1 0 0,1-1-1 0 0,-1 0 1 0 0,0 0-1 0 0,1 1 1 0 0,-1-1-1 0 0,1 0 1 0 0,-1 1-1 0 0,1-1 1 0 0,0 0 255 0 0,0-1-256 0 0,0 2-212 0 0,15-7 503 0 0,2 5-2992 0 0,-4 6 775 0 0,1 6-604 0 0,-7-2 1240 0 0</inkml:trace>
-  <inkml:trace contextRef="#ctx0" brushRef="#br0" timeOffset="8121.47">5580 551 948 0 0,'8'-1'9232'0'0,"-25"20"-9130"0"0,14-13-108 0 0,0 0 0 0 0,-1 0 0 0 0,1 0 0 0 0,-1-1 0 0 0,-8 9 0 0 0,-13 21 17 0 0,-53 93-787 0 0,43-85-1369 0 0,29-36 1048 0 0,-1-1-1 0 0,0 0 1 0 0,0 0-1 0 0,-8 4 1 0 0</inkml:trace>
-  <inkml:trace contextRef="#ctx0" brushRef="#br0" timeOffset="8342.96">5422 602 464 0 0,'8'-10'2957'0'0,"-8"9"-2875"0"0,0 1 0 0 0,0 0 1 0 0,0 0-1 0 0,0-1 0 0 0,0 1 0 0 0,0 0 0 0 0,0-1 0 0 0,1 1 1 0 0,-1 0-1 0 0,0-1 0 0 0,0 1 0 0 0,0 0 0 0 0,0 0 0 0 0,1-1 0 0 0,-1 1 1 0 0,0 0-1 0 0,0 0 0 0 0,1-1 0 0 0,-1 1 0 0 0,0 0 0 0 0,0 0 0 0 0,1 0 1 0 0,-1 0-1 0 0,0-1 0 0 0,1 1 0 0 0,-1 0 0 0 0,0 0 0 0 0,0 0 0 0 0,1 0 1 0 0,-1 0-1 0 0,1 0 0 0 0,2 3-26 0 0,0 0 0 0 0,1 0-1 0 0,-1 0 1 0 0,-1 1 0 0 0,1-1 0 0 0,0 1 0 0 0,2 5 0 0 0,0 0-32 0 0,0 1 0 0 0,1-1 0 0 0,11 13 0 0 0,-10-13-8 0 0,0 0 0 0 0,0 0 0 0 0,8 18 0 0 0,-8-9-270 0 0,0 1 0 0 0,9 37 1 0 0,-15-49-276 0 0,-1 0 0 0 0,0 0-1 0 0,0 0 1 0 0,0 1 0 0 0,-1-1 0 0 0,0 0 0 0 0,-3 13 0 0 0,2-3-630 0 0</inkml:trace>
-  <inkml:trace contextRef="#ctx0" brushRef="#br0" timeOffset="8973.35">3861 1314 588 0 0,'-7'0'4974'0'0,"21"1"-1770"0"0,28-1-1046 0 0,342-41 138 0 0,199 10-2375 0 0,-436 24 67 0 0,79-3 24 0 0,-208 8-148 0 0,-17 1 98 0 0,-1 1 0 0 0,0 0 0 0 0,0 0 0 0 0,0 0 0 0 0,1 0 0 0 0,-1 0 0 0 0,0 0-1 0 0,0-1 1 0 0,0 1 0 0 0,1 0 0 0 0,-1 0 0 0 0,0 0 0 0 0,0-1 0 0 0,0 1 0 0 0,0 0 0 0 0,0 0 0 0 0,0-1 0 0 0,1 1 0 0 0,-1 0 0 0 0,0 0 0 0 0,0 0 0 0 0,0-1 0 0 0,0 1 0 0 0,0 0 0 0 0,0 0-1 0 0,0-1 1 0 0,0 1 0 0 0,0 0 0 0 0,0-1 0 0 0,0 1 0 0 0,0 0 0 0 0,0 0 0 0 0,0 0 0 0 0,0-1 0 0 0,0 1 0 0 0,-1 0 0 0 0,1 0 0 0 0,0-1 0 0 0,0 1 0 0 0,0 0 0 0 0,0 0 0 0 0,0-1 0 0 0,-1 1-1 0 0,1 0 1 0 0,0 0 0 0 0,0 0 0 0 0,0 0 0 0 0,0-1 0 0 0,-1 1 0 0 0,1 0 0 0 0,0 0 0 0 0,0 0 0 0 0,-1 0 0 0 0,1 0 0 0 0,0 0 0 0 0,0 0 0 0 0,-1-1 0 0 0,-11-11-3176 0 0,10 9 2741 0 0,0 1-1 0 0,0 0 1 0 0,0 0 0 0 0,-1 0 0 0 0,1 0-1 0 0,-1 0 1 0 0,1 0 0 0 0,-1 1 0 0 0,-4-3 0 0 0,-15-5-1283 0 0</inkml:trace>
+  <inkml:trace contextRef="#ctx0" brushRef="#br0" timeOffset="8121.46">5580 551 948 0 0,'8'-1'9232'0'0,"-25"20"-9130"0"0,14-13-108 0 0,0 0 0 0 0,-1 0 0 0 0,1 0 0 0 0,-1-1 0 0 0,-8 9 0 0 0,-13 21 17 0 0,-53 93-787 0 0,43-85-1369 0 0,29-36 1048 0 0,-1-1-1 0 0,0 0 1 0 0,0 0-1 0 0,-8 4 1 0 0</inkml:trace>
+  <inkml:trace contextRef="#ctx0" brushRef="#br0" timeOffset="8342.95">5422 602 464 0 0,'8'-10'2957'0'0,"-8"9"-2875"0"0,0 1 0 0 0,0 0 1 0 0,0 0-1 0 0,0-1 0 0 0,0 1 0 0 0,0 0 0 0 0,0-1 0 0 0,1 1 1 0 0,-1 0-1 0 0,0-1 0 0 0,0 1 0 0 0,0 0 0 0 0,0 0 0 0 0,1-1 0 0 0,-1 1 1 0 0,0 0-1 0 0,0 0 0 0 0,1-1 0 0 0,-1 1 0 0 0,0 0 0 0 0,0 0 0 0 0,1 0 1 0 0,-1 0-1 0 0,0-1 0 0 0,1 1 0 0 0,-1 0 0 0 0,0 0 0 0 0,0 0 0 0 0,1 0 1 0 0,-1 0-1 0 0,1 0 0 0 0,2 3-26 0 0,0 0 0 0 0,1 0-1 0 0,-1 0 1 0 0,-1 1 0 0 0,1-1 0 0 0,0 1 0 0 0,2 5 0 0 0,0 0-32 0 0,0 1 0 0 0,1-1 0 0 0,11 13 0 0 0,-10-13-8 0 0,0 0 0 0 0,0 0 0 0 0,8 18 0 0 0,-8-9-270 0 0,0 1 0 0 0,9 37 1 0 0,-15-49-276 0 0,-1 0 0 0 0,0 0-1 0 0,0 0 1 0 0,0 1 0 0 0,-1-1 0 0 0,0 0 0 0 0,-3 13 0 0 0,2-3-630 0 0</inkml:trace>
+  <inkml:trace contextRef="#ctx0" brushRef="#br0" timeOffset="8973.34">3861 1314 588 0 0,'-7'0'4974'0'0,"21"1"-1770"0"0,28-1-1046 0 0,342-41 138 0 0,199 10-2375 0 0,-436 24 67 0 0,79-3 24 0 0,-208 8-148 0 0,-17 1 98 0 0,-1 1 0 0 0,0 0 0 0 0,0 0 0 0 0,0 0 0 0 0,1 0 0 0 0,-1 0 0 0 0,0 0-1 0 0,0-1 1 0 0,0 1 0 0 0,1 0 0 0 0,-1 0 0 0 0,0 0 0 0 0,0-1 0 0 0,0 1 0 0 0,0 0 0 0 0,0 0 0 0 0,0-1 0 0 0,1 1 0 0 0,-1 0 0 0 0,0 0 0 0 0,0 0 0 0 0,0-1 0 0 0,0 1 0 0 0,0 0 0 0 0,0 0-1 0 0,0-1 1 0 0,0 1 0 0 0,0 0 0 0 0,0-1 0 0 0,0 1 0 0 0,0 0 0 0 0,0 0 0 0 0,0 0 0 0 0,0-1 0 0 0,0 1 0 0 0,-1 0 0 0 0,1 0 0 0 0,0-1 0 0 0,0 1 0 0 0,0 0 0 0 0,0 0 0 0 0,0-1 0 0 0,-1 1-1 0 0,1 0 1 0 0,0 0 0 0 0,0 0 0 0 0,0 0 0 0 0,0-1 0 0 0,-1 1 0 0 0,1 0 0 0 0,0 0 0 0 0,0 0 0 0 0,-1 0 0 0 0,1 0 0 0 0,0 0 0 0 0,0 0 0 0 0,-1-1 0 0 0,-11-11-3176 0 0,10 9 2741 0 0,0 1-1 0 0,0 0 1 0 0,0 0 0 0 0,-1 0 0 0 0,1 0-1 0 0,-1 0 1 0 0,1 0 0 0 0,-1 1 0 0 0,-4-3 0 0 0,-15-5-1283 0 0</inkml:trace>
   <inkml:trace contextRef="#ctx0" brushRef="#br0" timeOffset="9531.91">2547 819 680 0 0,'11'0'5794'0'0,"50"0"-4946"0"0,313-16 1353 0 0,1 1-2010 0 0,-184 17-184 0 0,172-3-1511 0 0,-310-1 598 0 0,103-7-5162 0 0,-146 6 4853 0 0</inkml:trace>
   <inkml:trace contextRef="#ctx0" brushRef="#br0" timeOffset="12136.47">3213 594 264 0 0,'0'0'3619'0'0,"6"4"-3124"0"0,-10-1-444 0 0,0 0 0 0 0,0 0-1 0 0,1 0 1 0 0,-1 0 0 0 0,1 1 0 0 0,0-1 0 0 0,-4 6 0 0 0,0 0 62 0 0,-9 16 150 0 0,-20 12 522 0 0,32-32-713 0 0,1 0 0 0 0,-1-1 1 0 0,0 1-1 0 0,0-1 0 0 0,-1 0 0 0 0,1 0 1 0 0,-7 4-1 0 0,10-5-66 0 0,1-2-6 0 0,0 0 0 0 0,-1-1-1 0 0,1 1 1 0 0,0 0-1 0 0,-1 0 1 0 0,1 0-1 0 0,-1 0 1 0 0,1-1 0 0 0,0 1-1 0 0,-1 0 1 0 0,0 0-1 0 0,1-1 1 0 0,-1 1-1 0 0,1 0 1 0 0,-1-1-1 0 0,0 1 1 0 0,-1 0 0 0 0</inkml:trace>
 </inkml:ink>

</xml_diff>